<commit_message>
docs: small corrections of the report (date)
</commit_message>
<xml_diff>
--- a/docs/REPORT.docx
+++ b/docs/REPORT.docx
@@ -33,7 +33,25 @@
           <w:sz w:val="18"/>
           <w:szCs w:val="18"/>
         </w:rPr>
-        <w:t>Oleksandr Serhiichyk  ·  Senior .NET Engineer home assignment  ·  26 July 2026</w:t>
+        <w:t>Oleksandr Serhiichyk  ·  Senior .NET Engineer home assignment  ·  2</w:t>
+      </w:r>
+      <w:r>
+        <w:rPr>
+          <w:rFonts w:eastAsia="Calibri" w:cs="Calibri"/>
+          <w:color w:val="595959"/>
+          <w:sz w:val="18"/>
+          <w:szCs w:val="18"/>
+        </w:rPr>
+        <w:t>7</w:t>
+      </w:r>
+      <w:r>
+        <w:rPr>
+          <w:rFonts w:eastAsia="Calibri" w:cs="Calibri"/>
+          <w:color w:val="595959"/>
+          <w:sz w:val="18"/>
+          <w:szCs w:val="18"/>
+        </w:rPr>
+        <w:t xml:space="preserve"> July 2026</w:t>
       </w:r>
     </w:p>
     <w:p>
@@ -187,8 +205,8 @@
         </w:tblCellMar>
       </w:tblPr>
       <w:tblGrid>
-        <w:gridCol w:w="4103"/>
-        <w:gridCol w:w="432"/>
+        <w:gridCol w:w="4102"/>
+        <w:gridCol w:w="433"/>
         <w:gridCol w:w="4824"/>
       </w:tblGrid>
       <w:tr>
@@ -197,7 +215,7 @@
         </w:trPr>
         <w:tc>
           <w:tcPr>
-            <w:tcW w:w="4103" w:type="dxa"/>
+            <w:tcW w:w="4102" w:type="dxa"/>
             <w:tcBorders/>
             <w:shd w:color="auto" w:fill="F2F2F2" w:val="clear"/>
           </w:tcPr>
@@ -277,7 +295,7 @@
         </w:tc>
         <w:tc>
           <w:tcPr>
-            <w:tcW w:w="432" w:type="dxa"/>
+            <w:tcW w:w="433" w:type="dxa"/>
             <w:tcBorders/>
           </w:tcPr>
           <w:p>
@@ -365,7 +383,7 @@
         </w:trPr>
         <w:tc>
           <w:tcPr>
-            <w:tcW w:w="4103" w:type="dxa"/>
+            <w:tcW w:w="4102" w:type="dxa"/>
             <w:tcBorders/>
           </w:tcPr>
           <w:p>
@@ -396,7 +414,7 @@
         </w:tc>
         <w:tc>
           <w:tcPr>
-            <w:tcW w:w="432" w:type="dxa"/>
+            <w:tcW w:w="433" w:type="dxa"/>
             <w:tcBorders/>
           </w:tcPr>
           <w:p>
@@ -433,7 +451,7 @@
         </w:trPr>
         <w:tc>
           <w:tcPr>
-            <w:tcW w:w="4103" w:type="dxa"/>
+            <w:tcW w:w="4102" w:type="dxa"/>
             <w:tcBorders/>
             <w:shd w:color="auto" w:fill="F2F2F2" w:val="clear"/>
           </w:tcPr>
@@ -481,7 +499,7 @@
         </w:tc>
         <w:tc>
           <w:tcPr>
-            <w:tcW w:w="432" w:type="dxa"/>
+            <w:tcW w:w="433" w:type="dxa"/>
             <w:tcBorders/>
           </w:tcPr>
           <w:p>
@@ -562,7 +580,7 @@
         </w:trPr>
         <w:tc>
           <w:tcPr>
-            <w:tcW w:w="4103" w:type="dxa"/>
+            <w:tcW w:w="4102" w:type="dxa"/>
             <w:tcBorders/>
           </w:tcPr>
           <w:p>
@@ -593,7 +611,7 @@
         </w:tc>
         <w:tc>
           <w:tcPr>
-            <w:tcW w:w="432" w:type="dxa"/>
+            <w:tcW w:w="433" w:type="dxa"/>
             <w:tcBorders/>
           </w:tcPr>
           <w:p>
@@ -630,7 +648,7 @@
         </w:trPr>
         <w:tc>
           <w:tcPr>
-            <w:tcW w:w="4103" w:type="dxa"/>
+            <w:tcW w:w="4102" w:type="dxa"/>
             <w:tcBorders/>
             <w:shd w:color="auto" w:fill="F2F2F2" w:val="clear"/>
           </w:tcPr>
@@ -742,7 +760,7 @@
         </w:tc>
         <w:tc>
           <w:tcPr>
-            <w:tcW w:w="432" w:type="dxa"/>
+            <w:tcW w:w="433" w:type="dxa"/>
             <w:tcBorders/>
           </w:tcPr>
           <w:p>
@@ -915,7 +933,7 @@
         </w:trPr>
         <w:tc>
           <w:tcPr>
-            <w:tcW w:w="4103" w:type="dxa"/>
+            <w:tcW w:w="4102" w:type="dxa"/>
             <w:tcBorders/>
           </w:tcPr>
           <w:p>
@@ -946,7 +964,7 @@
         </w:tc>
         <w:tc>
           <w:tcPr>
-            <w:tcW w:w="432" w:type="dxa"/>
+            <w:tcW w:w="433" w:type="dxa"/>
             <w:tcBorders/>
           </w:tcPr>
           <w:p>
@@ -983,7 +1001,7 @@
         </w:trPr>
         <w:tc>
           <w:tcPr>
-            <w:tcW w:w="4103" w:type="dxa"/>
+            <w:tcW w:w="4102" w:type="dxa"/>
             <w:tcBorders/>
             <w:shd w:color="auto" w:fill="F2F2F2" w:val="clear"/>
           </w:tcPr>
@@ -1047,7 +1065,7 @@
         </w:tc>
         <w:tc>
           <w:tcPr>
-            <w:tcW w:w="432" w:type="dxa"/>
+            <w:tcW w:w="433" w:type="dxa"/>
             <w:tcBorders/>
           </w:tcPr>
           <w:p>
@@ -2563,8 +2581,8 @@
       <w:tblGrid>
         <w:gridCol w:w="1944"/>
         <w:gridCol w:w="2952"/>
-        <w:gridCol w:w="3383"/>
-        <w:gridCol w:w="1081"/>
+        <w:gridCol w:w="3382"/>
+        <w:gridCol w:w="1082"/>
       </w:tblGrid>
       <w:tr>
         <w:trPr>
@@ -2631,7 +2649,7 @@
         </w:tc>
         <w:tc>
           <w:tcPr>
-            <w:tcW w:w="3383" w:type="dxa"/>
+            <w:tcW w:w="3382" w:type="dxa"/>
             <w:tcBorders>
               <w:top w:val="single" w:sz="4" w:space="0" w:color="000000"/>
               <w:start w:val="single" w:sz="4" w:space="0" w:color="000000"/>
@@ -2660,7 +2678,7 @@
         </w:tc>
         <w:tc>
           <w:tcPr>
-            <w:tcW w:w="1081" w:type="dxa"/>
+            <w:tcW w:w="1082" w:type="dxa"/>
             <w:tcBorders>
               <w:top w:val="single" w:sz="4" w:space="0" w:color="000000"/>
               <w:start w:val="single" w:sz="4" w:space="0" w:color="000000"/>
@@ -2762,7 +2780,7 @@
         </w:tc>
         <w:tc>
           <w:tcPr>
-            <w:tcW w:w="3383" w:type="dxa"/>
+            <w:tcW w:w="3382" w:type="dxa"/>
             <w:tcBorders>
               <w:top w:val="single" w:sz="4" w:space="0" w:color="000000"/>
               <w:start w:val="single" w:sz="4" w:space="0" w:color="000000"/>
@@ -2788,7 +2806,7 @@
         </w:tc>
         <w:tc>
           <w:tcPr>
-            <w:tcW w:w="1081" w:type="dxa"/>
+            <w:tcW w:w="1082" w:type="dxa"/>
             <w:tcBorders>
               <w:top w:val="single" w:sz="4" w:space="0" w:color="000000"/>
               <w:start w:val="single" w:sz="4" w:space="0" w:color="000000"/>
@@ -2872,7 +2890,7 @@
         </w:tc>
         <w:tc>
           <w:tcPr>
-            <w:tcW w:w="3383" w:type="dxa"/>
+            <w:tcW w:w="3382" w:type="dxa"/>
             <w:tcBorders>
               <w:top w:val="single" w:sz="4" w:space="0" w:color="000000"/>
               <w:start w:val="single" w:sz="4" w:space="0" w:color="000000"/>
@@ -2898,7 +2916,7 @@
         </w:tc>
         <w:tc>
           <w:tcPr>
-            <w:tcW w:w="1081" w:type="dxa"/>
+            <w:tcW w:w="1082" w:type="dxa"/>
             <w:tcBorders>
               <w:top w:val="single" w:sz="4" w:space="0" w:color="000000"/>
               <w:start w:val="single" w:sz="4" w:space="0" w:color="000000"/>
@@ -2998,7 +3016,7 @@
         </w:tc>
         <w:tc>
           <w:tcPr>
-            <w:tcW w:w="3383" w:type="dxa"/>
+            <w:tcW w:w="3382" w:type="dxa"/>
             <w:tcBorders>
               <w:top w:val="single" w:sz="4" w:space="0" w:color="000000"/>
               <w:start w:val="single" w:sz="4" w:space="0" w:color="000000"/>
@@ -3024,7 +3042,7 @@
         </w:tc>
         <w:tc>
           <w:tcPr>
-            <w:tcW w:w="1081" w:type="dxa"/>
+            <w:tcW w:w="1082" w:type="dxa"/>
             <w:tcBorders>
               <w:top w:val="single" w:sz="4" w:space="0" w:color="000000"/>
               <w:start w:val="single" w:sz="4" w:space="0" w:color="000000"/>
@@ -3124,7 +3142,7 @@
         </w:tc>
         <w:tc>
           <w:tcPr>
-            <w:tcW w:w="3383" w:type="dxa"/>
+            <w:tcW w:w="3382" w:type="dxa"/>
             <w:tcBorders>
               <w:top w:val="single" w:sz="4" w:space="0" w:color="000000"/>
               <w:start w:val="single" w:sz="4" w:space="0" w:color="000000"/>
@@ -3150,7 +3168,7 @@
         </w:tc>
         <w:tc>
           <w:tcPr>
-            <w:tcW w:w="1081" w:type="dxa"/>
+            <w:tcW w:w="1082" w:type="dxa"/>
             <w:tcBorders>
               <w:top w:val="single" w:sz="4" w:space="0" w:color="000000"/>
               <w:start w:val="single" w:sz="4" w:space="0" w:color="000000"/>
@@ -3244,7 +3262,7 @@
         </w:tc>
         <w:tc>
           <w:tcPr>
-            <w:tcW w:w="3383" w:type="dxa"/>
+            <w:tcW w:w="3382" w:type="dxa"/>
             <w:tcBorders>
               <w:top w:val="single" w:sz="4" w:space="0" w:color="000000"/>
               <w:start w:val="single" w:sz="4" w:space="0" w:color="000000"/>
@@ -3270,7 +3288,7 @@
         </w:tc>
         <w:tc>
           <w:tcPr>
-            <w:tcW w:w="1081" w:type="dxa"/>
+            <w:tcW w:w="1082" w:type="dxa"/>
             <w:tcBorders>
               <w:top w:val="single" w:sz="4" w:space="0" w:color="000000"/>
               <w:start w:val="single" w:sz="4" w:space="0" w:color="000000"/>
@@ -3354,7 +3372,7 @@
         </w:tc>
         <w:tc>
           <w:tcPr>
-            <w:tcW w:w="3383" w:type="dxa"/>
+            <w:tcW w:w="3382" w:type="dxa"/>
             <w:tcBorders>
               <w:top w:val="single" w:sz="4" w:space="0" w:color="000000"/>
               <w:start w:val="single" w:sz="4" w:space="0" w:color="000000"/>
@@ -3380,7 +3398,7 @@
         </w:tc>
         <w:tc>
           <w:tcPr>
-            <w:tcW w:w="1081" w:type="dxa"/>
+            <w:tcW w:w="1082" w:type="dxa"/>
             <w:tcBorders>
               <w:top w:val="single" w:sz="4" w:space="0" w:color="000000"/>
               <w:start w:val="single" w:sz="4" w:space="0" w:color="000000"/>
@@ -3464,7 +3482,7 @@
         </w:tc>
         <w:tc>
           <w:tcPr>
-            <w:tcW w:w="3383" w:type="dxa"/>
+            <w:tcW w:w="3382" w:type="dxa"/>
             <w:tcBorders>
               <w:top w:val="single" w:sz="4" w:space="0" w:color="000000"/>
               <w:start w:val="single" w:sz="4" w:space="0" w:color="000000"/>
@@ -3490,7 +3508,7 @@
         </w:tc>
         <w:tc>
           <w:tcPr>
-            <w:tcW w:w="1081" w:type="dxa"/>
+            <w:tcW w:w="1082" w:type="dxa"/>
             <w:tcBorders>
               <w:top w:val="single" w:sz="4" w:space="0" w:color="000000"/>
               <w:start w:val="single" w:sz="4" w:space="0" w:color="000000"/>
@@ -3574,7 +3592,7 @@
         </w:tc>
         <w:tc>
           <w:tcPr>
-            <w:tcW w:w="3383" w:type="dxa"/>
+            <w:tcW w:w="3382" w:type="dxa"/>
             <w:tcBorders>
               <w:top w:val="single" w:sz="4" w:space="0" w:color="000000"/>
               <w:start w:val="single" w:sz="4" w:space="0" w:color="000000"/>
@@ -3600,7 +3618,7 @@
         </w:tc>
         <w:tc>
           <w:tcPr>
-            <w:tcW w:w="1081" w:type="dxa"/>
+            <w:tcW w:w="1082" w:type="dxa"/>
             <w:tcBorders>
               <w:top w:val="single" w:sz="4" w:space="0" w:color="000000"/>
               <w:start w:val="single" w:sz="4" w:space="0" w:color="000000"/>
@@ -3684,7 +3702,7 @@
         </w:tc>
         <w:tc>
           <w:tcPr>
-            <w:tcW w:w="3383" w:type="dxa"/>
+            <w:tcW w:w="3382" w:type="dxa"/>
             <w:tcBorders>
               <w:top w:val="single" w:sz="4" w:space="0" w:color="000000"/>
               <w:start w:val="single" w:sz="4" w:space="0" w:color="000000"/>
@@ -3710,7 +3728,7 @@
         </w:tc>
         <w:tc>
           <w:tcPr>
-            <w:tcW w:w="1081" w:type="dxa"/>
+            <w:tcW w:w="1082" w:type="dxa"/>
             <w:tcBorders>
               <w:top w:val="single" w:sz="4" w:space="0" w:color="000000"/>
               <w:start w:val="single" w:sz="4" w:space="0" w:color="000000"/>
@@ -3794,7 +3812,7 @@
         </w:tc>
         <w:tc>
           <w:tcPr>
-            <w:tcW w:w="3383" w:type="dxa"/>
+            <w:tcW w:w="3382" w:type="dxa"/>
             <w:tcBorders>
               <w:top w:val="single" w:sz="4" w:space="0" w:color="000000"/>
               <w:start w:val="single" w:sz="4" w:space="0" w:color="000000"/>
@@ -3820,7 +3838,7 @@
         </w:tc>
         <w:tc>
           <w:tcPr>
-            <w:tcW w:w="1081" w:type="dxa"/>
+            <w:tcW w:w="1082" w:type="dxa"/>
             <w:tcBorders>
               <w:top w:val="single" w:sz="4" w:space="0" w:color="000000"/>
               <w:start w:val="single" w:sz="4" w:space="0" w:color="000000"/>
@@ -4082,9 +4100,9 @@
       <w:tblGrid>
         <w:gridCol w:w="374"/>
         <w:gridCol w:w="2088"/>
-        <w:gridCol w:w="2087"/>
+        <w:gridCol w:w="2086"/>
         <w:gridCol w:w="2088"/>
-        <w:gridCol w:w="1829"/>
+        <w:gridCol w:w="1830"/>
         <w:gridCol w:w="892"/>
       </w:tblGrid>
       <w:tr>
@@ -4152,7 +4170,7 @@
         </w:tc>
         <w:tc>
           <w:tcPr>
-            <w:tcW w:w="2087" w:type="dxa"/>
+            <w:tcW w:w="2086" w:type="dxa"/>
             <w:tcBorders>
               <w:top w:val="single" w:sz="4" w:space="0" w:color="000000"/>
               <w:start w:val="single" w:sz="4" w:space="0" w:color="000000"/>
@@ -4210,7 +4228,7 @@
         </w:tc>
         <w:tc>
           <w:tcPr>
-            <w:tcW w:w="1829" w:type="dxa"/>
+            <w:tcW w:w="1830" w:type="dxa"/>
             <w:tcBorders>
               <w:top w:val="single" w:sz="4" w:space="0" w:color="000000"/>
               <w:start w:val="single" w:sz="4" w:space="0" w:color="000000"/>
@@ -4356,7 +4374,7 @@
         </w:tc>
         <w:tc>
           <w:tcPr>
-            <w:tcW w:w="2087" w:type="dxa"/>
+            <w:tcW w:w="2086" w:type="dxa"/>
             <w:tcBorders>
               <w:top w:val="single" w:sz="4" w:space="0" w:color="000000"/>
               <w:start w:val="single" w:sz="4" w:space="0" w:color="000000"/>
@@ -4472,7 +4490,7 @@
         </w:tc>
         <w:tc>
           <w:tcPr>
-            <w:tcW w:w="1829" w:type="dxa"/>
+            <w:tcW w:w="1830" w:type="dxa"/>
             <w:tcBorders>
               <w:top w:val="single" w:sz="4" w:space="0" w:color="000000"/>
               <w:start w:val="single" w:sz="4" w:space="0" w:color="000000"/>
@@ -4676,7 +4694,7 @@
         </w:tc>
         <w:tc>
           <w:tcPr>
-            <w:tcW w:w="2087" w:type="dxa"/>
+            <w:tcW w:w="2086" w:type="dxa"/>
             <w:tcBorders>
               <w:top w:val="single" w:sz="4" w:space="0" w:color="000000"/>
               <w:start w:val="single" w:sz="4" w:space="0" w:color="000000"/>
@@ -4728,7 +4746,7 @@
         </w:tc>
         <w:tc>
           <w:tcPr>
-            <w:tcW w:w="1829" w:type="dxa"/>
+            <w:tcW w:w="1830" w:type="dxa"/>
             <w:tcBorders>
               <w:top w:val="single" w:sz="4" w:space="0" w:color="000000"/>
               <w:start w:val="single" w:sz="4" w:space="0" w:color="000000"/>
@@ -4940,7 +4958,7 @@
         </w:tc>
         <w:tc>
           <w:tcPr>
-            <w:tcW w:w="2087" w:type="dxa"/>
+            <w:tcW w:w="2086" w:type="dxa"/>
             <w:tcBorders>
               <w:top w:val="single" w:sz="4" w:space="0" w:color="000000"/>
               <w:start w:val="single" w:sz="4" w:space="0" w:color="000000"/>
@@ -4992,7 +5010,7 @@
         </w:tc>
         <w:tc>
           <w:tcPr>
-            <w:tcW w:w="1829" w:type="dxa"/>
+            <w:tcW w:w="1830" w:type="dxa"/>
             <w:tcBorders>
               <w:top w:val="single" w:sz="4" w:space="0" w:color="000000"/>
               <w:start w:val="single" w:sz="4" w:space="0" w:color="000000"/>
@@ -5158,7 +5176,7 @@
         </w:tc>
         <w:tc>
           <w:tcPr>
-            <w:tcW w:w="2087" w:type="dxa"/>
+            <w:tcW w:w="2086" w:type="dxa"/>
             <w:tcBorders>
               <w:top w:val="single" w:sz="4" w:space="0" w:color="000000"/>
               <w:start w:val="single" w:sz="4" w:space="0" w:color="000000"/>
@@ -5252,7 +5270,7 @@
         </w:tc>
         <w:tc>
           <w:tcPr>
-            <w:tcW w:w="1829" w:type="dxa"/>
+            <w:tcW w:w="1830" w:type="dxa"/>
             <w:tcBorders>
               <w:top w:val="single" w:sz="4" w:space="0" w:color="000000"/>
               <w:start w:val="single" w:sz="4" w:space="0" w:color="000000"/>
@@ -5395,7 +5413,7 @@
         </w:tc>
         <w:tc>
           <w:tcPr>
-            <w:tcW w:w="2087" w:type="dxa"/>
+            <w:tcW w:w="2086" w:type="dxa"/>
             <w:tcBorders>
               <w:top w:val="single" w:sz="4" w:space="0" w:color="000000"/>
               <w:start w:val="single" w:sz="4" w:space="0" w:color="000000"/>
@@ -5479,7 +5497,7 @@
         </w:tc>
         <w:tc>
           <w:tcPr>
-            <w:tcW w:w="1829" w:type="dxa"/>
+            <w:tcW w:w="1830" w:type="dxa"/>
             <w:tcBorders>
               <w:top w:val="single" w:sz="4" w:space="0" w:color="000000"/>
               <w:start w:val="single" w:sz="4" w:space="0" w:color="000000"/>
@@ -6624,6 +6642,7 @@
     <w:qFormat/>
     <w:pPr>
       <w:widowControl/>
+      <w:suppressAutoHyphens w:val="true"/>
       <w:bidi w:val="0"/>
       <w:spacing w:lineRule="auto" w:line="238" w:before="0" w:after="0"/>
       <w:jc w:val="start"/>
@@ -6708,11 +6727,18 @@
       <w:u w:val="single"/>
     </w:rPr>
   </w:style>
-  <w:style w:type="character" w:styleId="FootnoteCharacters">
-    <w:name w:val="Footnote Characters"/>
+  <w:style w:type="character" w:styleId="FootnoteCharactersuser">
+    <w:name w:val="Footnote Characters (user)"/>
     <w:uiPriority w:val="99"/>
     <w:semiHidden/>
     <w:unhideWhenUsed/>
+    <w:qFormat/>
+    <w:rPr>
+      <w:vertAlign w:val="superscript"/>
+    </w:rPr>
+  </w:style>
+  <w:style w:type="character" w:styleId="FootnoteCharacters">
+    <w:name w:val="Footnote Characters"/>
     <w:qFormat/>
     <w:rPr>
       <w:vertAlign w:val="superscript"/>
@@ -6736,11 +6762,18 @@
       <w:szCs w:val="20"/>
     </w:rPr>
   </w:style>
-  <w:style w:type="character" w:styleId="EndnoteCharacters">
-    <w:name w:val="Endnote Characters"/>
+  <w:style w:type="character" w:styleId="EndnoteCharactersuser">
+    <w:name w:val="Endnote Characters (user)"/>
     <w:uiPriority w:val="99"/>
     <w:semiHidden/>
     <w:unhideWhenUsed/>
+    <w:qFormat/>
+    <w:rPr>
+      <w:vertAlign w:val="superscript"/>
+    </w:rPr>
+  </w:style>
+  <w:style w:type="character" w:styleId="EndnoteCharacters">
+    <w:name w:val="Endnote Characters"/>
     <w:qFormat/>
     <w:rPr>
       <w:vertAlign w:val="superscript"/>
@@ -6837,6 +6870,7 @@
     <w:qFormat/>
     <w:pPr>
       <w:widowControl/>
+      <w:suppressAutoHyphens w:val="true"/>
       <w:bidi w:val="0"/>
       <w:spacing w:lineRule="auto" w:line="238" w:before="0" w:after="0"/>
       <w:jc w:val="start"/>
@@ -6857,6 +6891,7 @@
     <w:qFormat/>
     <w:pPr>
       <w:widowControl/>
+      <w:suppressAutoHyphens w:val="true"/>
       <w:bidi w:val="0"/>
       <w:spacing w:lineRule="auto" w:line="238" w:before="0" w:after="0"/>
       <w:jc w:val="start"/>

</xml_diff>